<commit_message>
docs(ch3): soften M-AIDA claims + clarify reproducibility basis
Address overclaim risk in §3.2.4 per review:
- Hedge Gartlehner et al. (2024) finding: "đạt độ chính xác cao" →
  "proof-of-concept ... độ chính xác hứa hẹn"; "kế thừa trực tiếp đồng
  thuận" → "nhất quán với các khuyến nghị"; soften "đe dọa giá trị" and
  "đồng thuận" to "có thể ảnh hưởng" / "các hướng dẫn"
- State that the LLM extraction step is non-deterministic, so
  reproducibility rests on the verified-and-locked dataset published on
  OSF (osf.io/z37kn), not on re-running the tool
- Clarify the κ ≥ 0.70 inter-coder threshold is a pre-registered target
  between two human coders (values [TBD] in P6), not a tool-vs-human metric

APA7 + consistency pass; rebuild chuong_3 and LUAN_AN_FULL (docx + pdf).

https://claude.ai/code/session_01TNqoRFY1vAVQL6GWg8X9M3
</commit_message>
<xml_diff>
--- a/dist/HO_SO_NOP/01_LUAN_AN/LUAN_AN_FULL_vi.docx
+++ b/dist/HO_SO_NOP/01_LUAN_AN/LUAN_AN_FULL_vi.docx
@@ -3856,7 +3856,7 @@
         <w:t xml:space="preserve"> </w:t>
       </w:r>
       <w:r>
-        <w:t xml:space="preserve">Trích xuất dữ liệu là khâu tốn công và dễ sai sót nhất của tổng quan hệ thống: rà soát phương pháp luận của Mathes và cộng sự (2017) ghi nhận tỷ lệ lỗi trích xuất lên tới 50% và các lỗi này tác động trực tiếp đến ước lượng độ lớn hiệu ứng, đe dọa giá trị của kết luận phân tích tổng hợp. Nhằm giảm gánh nặng thủ công và sai số đó, một lĩnh vực phương pháp luận về</w:t>
+        <w:t xml:space="preserve">Trích xuất dữ liệu là một trong những khâu tốn công và dễ sai sót của tổng quan hệ thống: rà soát phương pháp luận của Mathes và cộng sự (2017) ghi nhận tỷ lệ lỗi trích xuất có thể lên tới 50%, và những lỗi này có thể tác động đến ước lượng độ lớn hiệu ứng, qua đó ảnh hưởng đến độ tin cậy của kết luận phân tích tổng hợp. Nhằm giảm gánh nặng thủ công và sai số đó, một hướng phương pháp luận về</w:t>
       </w:r>
       <w:r>
         <w:t xml:space="preserve"> </w:t>
@@ -3872,7 +3872,7 @@
         <w:t xml:space="preserve"> </w:t>
       </w:r>
       <w:r>
-        <w:t xml:space="preserve">đã hình thành và được hệ thống hóa (Tsafnat et al., 2014; Marshall &amp; Wallace, 2019), trong đó tự động hóa khâu trích xuất dữ liệu được khảo sát riêng như một hướng khả thi (Jonnalagadda et al., 2015). Đồng thuận phương pháp luận nhấn mạnh rằng tự động hóa chỉ đóng vai</w:t>
+        <w:t xml:space="preserve">đã hình thành và dần được hệ thống hóa (Tsafnat et al., 2014; Marshall &amp; Wallace, 2019), trong đó tự động hóa khâu trích xuất dữ liệu được khảo sát riêng như một hướng khả thi (Jonnalagadda et al., 2015). Các hướng dẫn phương pháp luận nhấn mạnh rằng tự động hóa chỉ nên đóng vai</w:t>
       </w:r>
       <w:r>
         <w:t xml:space="preserve"> </w:t>
@@ -3901,7 +3901,7 @@
         <w:t xml:space="preserve">con người trong vòng lặp (human-in-the-loop)</w:t>
       </w:r>
       <w:r>
-        <w:t xml:space="preserve">. Bằng chứng gần đây củng cố cách tiếp cận này: nghiên cứu thử nghiệm của Gartlehner và cộng sự (2024) cho thấy một mô hình ngôn ngữ lớn (Claude) có thể trích xuất dữ liệu cho tổng hợp bằng chứng đạt độ chính xác cao, và kết luận rằng chính</w:t>
+        <w:t xml:space="preserve">. Bằng chứng gần đây ủng hộ cách tiếp cận này: nghiên cứu thử nghiệm (proof-of-concept) của Gartlehner và cộng sự (2024) bước đầu cho thấy một mô hình ngôn ngữ lớn (Claude) có thể hỗ trợ trích xuất dữ liệu cho tổng hợp bằng chứng với độ chính xác hứa hẹn, đồng thời nhấn mạnh rằng chính</w:t>
       </w:r>
       <w:r>
         <w:t xml:space="preserve"> </w:t>
@@ -3917,7 +3917,7 @@
         <w:t xml:space="preserve"> </w:t>
       </w:r>
       <w:r>
-        <w:t xml:space="preserve">mới nâng cao được chất lượng và hiệu suất trích xuất. Thiết kế của M-AIDA kế thừa trực tiếp đồng thuận phương pháp luận này.</w:t>
+        <w:t xml:space="preserve">mới là yếu tố nâng cao chất lượng và hiệu suất trích xuất. Thiết kế của M-AIDA được xây dựng nhất quán với các khuyến nghị này.</w:t>
       </w:r>
     </w:p>
     <w:p>
@@ -3938,7 +3938,7 @@
         <w:t xml:space="preserve">M-AIDA (Meta-Analysis Intelligent Data Assistant)</w:t>
       </w:r>
       <w:r>
-        <w:t xml:space="preserve">, một công cụ trích xuất bán tự động chuyên biệt cho quan hệ I-P do tác giả xây dựng (đã lập hồ sơ đăng ký quyền tác giả tại Cục Bản quyền Tác giả Việt Nam). M-AIDA vận hành theo nguyên lý</w:t>
+        <w:t xml:space="preserve">, một công cụ trích xuất bán tự động cho quan hệ I-P do tác giả xây dựng (đã lập hồ sơ đăng ký quyền tác giả tại Cục Bản quyền Tác giả Việt Nam). M-AIDA vận hành theo nguyên lý</w:t>
       </w:r>
       <w:r>
         <w:t xml:space="preserve"> </w:t>
@@ -3967,7 +3967,7 @@
         <w:t xml:space="preserve"> </w:t>
       </w:r>
       <w:r>
-        <w:t xml:space="preserve">trích xuất kèm đoạn trích nguồn nguyên văn; nghiên cứu sinh chủ trì bắt buộc rà soát, hiệu chỉnh và xác nhận từng đại lượng, sau đó bản ghi mới được</w:t>
+        <w:t xml:space="preserve">trích xuất kèm đoạn trích nguồn nguyên văn; nghiên cứu sinh chủ trì rà soát, hiệu chỉnh và xác nhận từng đại lượng, sau đó bản ghi mới được</w:t>
       </w:r>
       <w:r>
         <w:t xml:space="preserve"> </w:t>
@@ -3983,7 +3983,7 @@
         <w:t xml:space="preserve"> </w:t>
       </w:r>
       <w:r>
-        <w:t xml:space="preserve">kèm dấu thời gian để bảo đảm vết kiểm toán và khả năng tái lập. Tự động hóa rút ngắn thời gian, còn con người chịu trách nhiệm cuối cùng về tính hợp lệ của từng số liệu; do đó kết quả phân tích tổng hợp không lệ thuộc vào tính tự động của phần mềm.</w:t>
+        <w:t xml:space="preserve">kèm dấu thời gian, tạo vết kiểm toán cho từng quyết định trích xuất. Tự động hóa nhằm rút ngắn thời gian, còn con người giữ trách nhiệm cuối cùng về tính hợp lệ của từng số liệu; nhờ vậy, kết quả phân tích tổng hợp không phụ thuộc vào mức độ tự động hóa của phần mềm. Vì bước trích xuất bằng mô hình ngôn ngữ lớn không mang tính tất định — cùng một đầu vào có thể cho kết quả khác nhau — khả năng tái lập của nghiên cứu không dựa trên việc chạy lại công cụ mà dựa trên tập dữ liệu đã được kiểm chứng và khóa, công bố công khai trên OSF (https://osf.io/z37kn).</w:t>
       </w:r>
     </w:p>
     <w:p>
@@ -4606,7 +4606,7 @@
         <w:t xml:space="preserve"> </w:t>
       </w:r>
       <w:r>
-        <w:t xml:space="preserve">đều bị loại. Quy trình mã hóa và độ tin cậy liên mã hóa viên (Cohen’s</w:t>
+        <w:t xml:space="preserve">đều bị loại. Quy trình mã hóa và đánh giá độ tin cậy liên mã hóa viên giữa hai người (theo ngưỡng tiền đăng ký Cohen’s</w:t>
       </w:r>
       <w:r>
         <w:t xml:space="preserve"> </w:t>

</xml_diff>

<commit_message>
build: rebuild deliverables sau polish thuật ngữ (robust→vững chắc, gradient)
Dựng lại chuong_2/4/5, tóm tắt, CĐ2, và LUAN_AN_FULL (docx+pdf) để hồ sơ nộp
khớp prose đã polish. Đã verify docx chứa "vững chắc" (chuong_4 ×8) và hết
"robust" trần. Cập nhật HO_SO_NOP + downloads + luan_an_ctu + chuyen_de_1.

https://claude.ai/code/session_01TNqoRFY1vAVQL6GWg8X9M3
</commit_message>
<xml_diff>
--- a/dist/HO_SO_NOP/01_LUAN_AN/LUAN_AN_FULL_vi.docx
+++ b/dist/HO_SO_NOP/01_LUAN_AN/LUAN_AN_FULL_vi.docx
@@ -4001,7 +4001,7 @@
         <w:t xml:space="preserve">không bền vững</w:t>
       </w:r>
       <w:r>
-        <w:t xml:space="preserve">: kiểm định nhạy cảm bỏ ô Frontier (k = 3) đưa omnibus về không có ý nghĩa (Q_M = 1,49, p = 0,68), cho thấy ở cấp văn liệu điều tiết thể chế trực tiếp (chủ hiệu ứng phân nhóm) là yếu. Tính ngữ cảnh thể chế của quan hệ I-P do đó được luận án kiểm định mạnh hơn ở cấp doanh nghiệp qua tương tác có điều kiện (Chương 4), nơi vai trò điều tiết của chế độ thể chế bộc lộ robust. phân tích tổng hợp cũng phát hiện thiên lệch xuất bản đáng kể: phương pháp trim-and-fill bổ khuyết 58 nghiên cứu còn thiếu, kéo tác động tổng hợp điều chỉnh xuống r = 0,035, vẫn dương nhưng bị suy giảm. Kết quả này vừa xác nhận tác động dương nhỏ và bền vững, vừa nhấn mạnh rằng giá trị thực sự của nghiên cứu I-P nằm ở việc giải thích dị biệt, chứ không phải ở việc đo lại hiệu ứng trung bình.</w:t>
+        <w:t xml:space="preserve">: kiểm định nhạy cảm bỏ ô Frontier (k = 3) đưa omnibus về không có ý nghĩa (Q_M = 1,49, p = 0,68), cho thấy ở cấp văn liệu điều tiết thể chế trực tiếp (chủ hiệu ứng phân nhóm) là yếu. Tính ngữ cảnh thể chế của quan hệ I-P do đó được luận án kiểm định mạnh hơn ở cấp doanh nghiệp qua tương tác có điều kiện (Chương 4), nơi vai trò điều tiết của chế độ thể chế bộc lộ vững chắc. phân tích tổng hợp cũng phát hiện thiên lệch xuất bản đáng kể: phương pháp trim-and-fill bổ khuyết 58 nghiên cứu còn thiếu, kéo tác động tổng hợp điều chỉnh xuống r = 0,035, vẫn dương nhưng bị suy giảm. Kết quả này vừa xác nhận tác động dương nhỏ và bền vững, vừa nhấn mạnh rằng giá trị thực sự của nghiên cứu I-P nằm ở việc giải thích dị biệt, chứ không phải ở việc đo lại hiệu ứng trung bình.</w:t>
       </w:r>
     </w:p>
     <w:bookmarkEnd w:id="56"/>
@@ -28536,7 +28536,7 @@
           <w:bCs/>
           <w:b/>
         </w:rPr>
-        <w:t xml:space="preserve">điều tiết thể chế trực tiếp dưới dạng hiệu ứng chính phân nhóm là yếu và không robust</w:t>
+        <w:t xml:space="preserve">điều tiết thể chế trực tiếp dưới dạng hiệu ứng chính phân nhóm là yếu và không vững chắc</w:t>
       </w:r>
       <w:r>
         <w:t xml:space="preserve">. Đây không phải hạn chế làm suy yếu luận án, mà chính là khoảng trống định hướng cho phần tiếp theo: tính ngữ cảnh thể chế của quan hệ I-P không bộc lộ qua việc gộp chủ hiệu ứng phân nhóm ở cấp văn liệu, mà chỉ hiện ra khi mô hình hóa</w:t>
@@ -29400,7 +29400,7 @@
         <w:t xml:space="preserve"> </w:t>
       </w:r>
       <w:r>
-        <w:t xml:space="preserve">cung cấp bằng chứng robust về một dải biến thiên thể chế đơn điệu, cũng không về điều tiết thể chế trực tiếp nói chung; điều vững chắc duy nhất là hiệu ứng I-P dương nhỏ tương đối đồng nhất giữa các chế độ đông dữ liệu. Khoảng trống này được lấp ở cấp doanh nghiệp: phân tích đa quốc gia (Mục 4.3) cho thấy ICRV điều tiết quan hệ I-P một cách</w:t>
+        <w:t xml:space="preserve">cung cấp bằng chứng vững chắc về một dải biến thiên thể chế đơn điệu, cũng không về điều tiết thể chế trực tiếp nói chung; điều vững chắc duy nhất là hiệu ứng I-P dương nhỏ tương đối đồng nhất giữa các chế độ đông dữ liệu. Khoảng trống này được lấp ở cấp doanh nghiệp: phân tích đa quốc gia (Mục 4.3) cho thấy ICRV điều tiết quan hệ I-P một cách</w:t>
       </w:r>
       <w:r>
         <w:t xml:space="preserve"> </w:t>
@@ -29648,7 +29648,7 @@
         <w:t xml:space="preserve"> </w:t>
       </w:r>
       <w:r>
-        <w:t xml:space="preserve">ở cấp văn liệu. Mẫu hình thống nhất này — không một chủ hiệu ứng điều tiết nào (thể chế hay số) robust ở cấp tổng hợp — chính là cơ sở để chuyển sang đặc tả</w:t>
+        <w:t xml:space="preserve">ở cấp văn liệu. Mẫu hình thống nhất này — không một chủ hiệu ứng điều tiết nào (thể chế hay số) vững chắc ở cấp tổng hợp — chính là cơ sở để chuyển sang đặc tả</w:t>
       </w:r>
       <w:r>
         <w:t xml:space="preserve"> </w:t>
@@ -31018,7 +31018,7 @@
         <w:t xml:space="preserve"> </w:t>
       </w:r>
       <w:r>
-        <w:t xml:space="preserve">của hình chữ U ngược chứ không phải một gradient điểm uốn đơn điệu: độ cong sâu dần khi chất lượng thể chế suy giảm, làm hình phạt sau đỉnh gay gắt hơn ở các chế độ thể chế yếu (cận biên, SIDS), và phẳng dần về gần tuyến tính ở các chế độ tiên tiến.</w:t>
+        <w:t xml:space="preserve">của hình chữ U ngược chứ không phải một dải biến thiên điểm uốn đơn điệu: độ cong sâu dần khi chất lượng thể chế suy giảm, làm hình phạt sau đỉnh gay gắt hơn ở các chế độ thể chế yếu (cận biên, SIDS), và phẳng dần về gần tuyến tính ở các chế độ tiên tiến.</w:t>
       </w:r>
     </w:p>
     <w:p>
@@ -31086,7 +31086,7 @@
           <w:bCs/>
           <w:b/>
         </w:rPr>
-        <w:t xml:space="preserve">robust</w:t>
+        <w:t xml:space="preserve">vững chắc</w:t>
       </w:r>
       <w:r>
         <w:t xml:space="preserve"> </w:t>
@@ -31196,7 +31196,7 @@
         <w:t xml:space="preserve">bổ sung chứ không trùng lặp</w:t>
       </w:r>
       <w:r>
-        <w:t xml:space="preserve">: đặc tả có điều kiện (tương tác) ở cấp doanh nghiệp làm lộ ra vai trò điều tiết của chế độ thể chế mà việc gộp chủ hiệu ứng phân nhóm ở cấp tổng hợp không phát hiện được một cách robust. Đây chính là giá trị gia tăng cốt lõi của phân tích sơ cấp 45 nền kinh tế so với tổng hợp văn liệu hiện có, và là lý do biện minh cho việc luận án không dừng ở meta-analysis mà tiến đến mô hình hóa tương tác ở cấp vi mô.</w:t>
+        <w:t xml:space="preserve">: đặc tả có điều kiện (tương tác) ở cấp doanh nghiệp làm lộ ra vai trò điều tiết của chế độ thể chế mà việc gộp chủ hiệu ứng phân nhóm ở cấp tổng hợp không phát hiện được một cách vững chắc. Đây chính là giá trị gia tăng cốt lõi của phân tích sơ cấp 45 nền kinh tế so với tổng hợp văn liệu hiện có, và là lý do biện minh cho việc luận án không dừng ở meta-analysis mà tiến đến mô hình hóa tương tác ở cấp vi mô.</w:t>
       </w:r>
     </w:p>
     <w:bookmarkEnd w:id="122"/>
@@ -37168,7 +37168,7 @@
         <w:t xml:space="preserve"> </w:t>
       </w:r>
       <w:r>
-        <w:t xml:space="preserve">của hình chữ U ngược chứ không phải một gradient điểm uốn đơn điệu: độ cong sâu dần khi chất lượng thể chế suy giảm, làm hình phạt sau đỉnh gay gắt hơn ở chế độ cận biên và dễ tổn thương, và phẳng dần về gần tuyến tính ở chế độ tiên tiến.</w:t>
+        <w:t xml:space="preserve">của hình chữ U ngược chứ không phải một dải biến thiên điểm uốn đơn điệu: độ cong sâu dần khi chất lượng thể chế suy giảm, làm hình phạt sau đỉnh gay gắt hơn ở chế độ cận biên và dễ tổn thương, và phẳng dần về gần tuyến tính ở chế độ tiên tiến.</w:t>
       </w:r>
     </w:p>
     <w:p>
@@ -38189,7 +38189,7 @@
               </m:r>
             </m:oMath>
             <w:r>
-              <w:t xml:space="preserve">): điều tiết thể chế chỉ bộc lộ robust khi mô hình hóa tương tác, không phải khi so sánh chủ hiệu ứng phân nhóm. Cơ chế là độ cong/biên độ (sâu dần khi thể chế suy giảm), không phải dịch chuyển điểm uốn đơn điệu</w:t>
+              <w:t xml:space="preserve">): điều tiết thể chế chỉ bộc lộ vững chắc khi mô hình hóa tương tác, không phải khi so sánh chủ hiệu ứng phân nhóm. Cơ chế là độ cong/biên độ (sâu dần khi thể chế suy giảm), không phải dịch chuyển điểm uốn đơn điệu</w:t>
             </w:r>
           </w:p>
         </w:tc>
@@ -42387,7 +42387,7 @@
         <w:pStyle w:val="FirstParagraph"/>
       </w:pPr>
       <w:r>
-        <w:t xml:space="preserve">Về lý thuyết, luận án đóng góp vào ba dòng nghiên cứu. Với dòng phân tích tổng hợp về quan hệ I-P, luận án phân tách cấu trúc dị biệt và cho thấy điều tiết thể chế trực tiếp ở cấp văn liệu là yếu/không bền vững, trong khi vai trò điều tiết của ICRV chỉ bộc lộ robust ở cấp doanh nghiệp qua tương tác có điều kiện. Với dòng nghiên cứu về năng lực số, luận án làm rõ rằng DAI là nguồn lực tình huống chứ không phải năng lực nền tảng. Và với dòng nghiên cứu về quốc tế hóa và các nền kinh tế đảo nhỏ, luận án đặt tên cùng cung cấp bằng chứng đầu tiên cho FIP.</w:t>
+        <w:t xml:space="preserve">Về lý thuyết, luận án đóng góp vào ba dòng nghiên cứu. Với dòng phân tích tổng hợp về quan hệ I-P, luận án phân tách cấu trúc dị biệt và cho thấy điều tiết thể chế trực tiếp ở cấp văn liệu là yếu/không bền vững, trong khi vai trò điều tiết của ICRV chỉ bộc lộ vững chắc ở cấp doanh nghiệp qua tương tác có điều kiện. Với dòng nghiên cứu về năng lực số, luận án làm rõ rằng DAI là nguồn lực tình huống chứ không phải năng lực nền tảng. Và với dòng nghiên cứu về quốc tế hóa và các nền kinh tế đảo nhỏ, luận án đặt tên cùng cung cấp bằng chứng đầu tiên cho FIP.</w:t>
       </w:r>
     </w:p>
     <w:p>

</xml_diff>